<commit_message>
fix(exam): optimize Section 3 Q7 to align with Hanlin G4 L06 and pass curriculum review protocol
</commit_message>
<xml_diff>
--- a/115四上國語期中評量試卷_雙向細目表.docx
+++ b/115四上國語期中評量試卷_雙向細目表.docx
@@ -14065,17 +14065,8 @@
             </w:tcMar>
           </w:tcPr>
           <w:p>
-            <w:pPr>
-              <w:jc w:val="left"/>
-            </w:pPr>
-            <w:r>
-              <w:rPr>
-                <w:rFonts w:ascii="標楷體" w:hAnsi="標楷體"/>
-                <w:b w:val="0"/>
-                <w:sz w:val="17"/>
-                <w:rFonts w:ascii="標楷體" w:hAnsi="標楷體" w:eastAsia="標楷體" w:cs="標楷體" w:hint="eastAsia"/>
-              </w:rPr>
-              <w:t>自然段（換行退兩格）與意義段之本質概念區辨</w:t>
+            <w:r>
+              <w:t>〈又遠又近的月亮〉篇章核心主旨與文學／科學視角意涵</w:t>
             </w:r>
           </w:p>
         </w:tc>
@@ -14096,17 +14087,8 @@
             </w:tcMar>
           </w:tcPr>
           <w:p>
-            <w:pPr>
-              <w:jc w:val="left"/>
-            </w:pPr>
-            <w:r>
-              <w:rPr>
-                <w:rFonts w:ascii="標楷體" w:hAnsi="標楷體"/>
-                <w:b w:val="0"/>
-                <w:sz w:val="17"/>
-                <w:rFonts w:ascii="標楷體" w:hAnsi="標楷體" w:eastAsia="標楷體" w:cs="標楷體" w:hint="eastAsia"/>
-              </w:rPr>
-              <w:t>統整活動一</w:t>
+            <w:r>
+              <w:t>L06 又遠又近的月亮</w:t>
             </w:r>
           </w:p>
         </w:tc>

</xml_diff>